<commit_message>
spec do trab. 1 de lab. pc2
</commit_message>
<xml_diff>
--- a/aulas/lab-poo/trabalhos/Trabalho1-PC2-T01.docx
+++ b/aulas/lab-poo/trabalhos/Trabalho1-PC2-T01.docx
@@ -561,7 +561,7 @@
           <w:szCs w:val="24"/>
           <w:rtl w:val="0"/>
         </w:rPr>
-        <w:t xml:space="preserve"> grupos de 4 pessoas. Como são 40 alunos no total, serão 10 grupos de 4 pessoas.</w:t>
+        <w:t xml:space="preserve"> grupos de 4 pessoas. Como são 23 alunos no total, serão 5 grupos de 4 pessoas e 1 grupo de 3 pessoas.</w:t>
       </w:r>
       <w:r>
         <w:rPr>
@@ -581,7 +581,7 @@
           <w:szCs w:val="24"/>
           <w:rtl w:val="0"/>
         </w:rPr>
-        <w:t xml:space="preserve">O trabalho deverá ser feito obrigatoriamente na linguagem Java.</w:t>
+        <w:t xml:space="preserve">O trabalho deverá ser feito obrigatoriamente na linguagem Python.</w:t>
       </w:r>
       <w:r>
         <w:rPr>

</xml_diff>